<commit_message>
github url was missing
</commit_message>
<xml_diff>
--- a/Synergy_TP/task_6/report/Software_ML_Taskphase_Report.docx
+++ b/Synergy_TP/task_6/report/Software_ML_Taskphase_Report.docx
@@ -17,19 +17,8 @@
           <w:sz w:val="48"/>
           <w:szCs w:val="48"/>
         </w:rPr>
-        <w:t xml:space="preserve">Software / ML Domain </w:t>
-      </w:r>
-      <w:proofErr w:type="spellStart"/>
-      <w:r>
-        <w:rPr>
-          <w:b/>
-          <w:bCs/>
-          <w:sz w:val="48"/>
-          <w:szCs w:val="48"/>
-        </w:rPr>
-        <w:t>Taskphase</w:t>
-      </w:r>
-      <w:proofErr w:type="spellEnd"/>
+        <w:t>Software / ML Domain Taskphase</w:t>
+      </w:r>
     </w:p>
     <w:p>
       <w:pPr>
@@ -66,11 +55,9 @@
         <w:spacing w:after="80"/>
         <w:jc w:val="center"/>
       </w:pPr>
-      <w:proofErr w:type="spellStart"/>
       <w:r>
         <w:t>Abhigyan</w:t>
       </w:r>
-      <w:proofErr w:type="spellEnd"/>
     </w:p>
     <w:p>
       <w:pPr>
@@ -116,7 +103,7 @@
           <w:rPr>
             <w:rStyle w:val="Hyperlink"/>
           </w:rPr>
-          <w:t>https://github.com/[your-username]/Synergy_TP</w:t>
+          <w:t>https://github.com/pandeyabhigyan005-hue/Synergy_TP.git</w:t>
         </w:r>
       </w:hyperlink>
     </w:p>
@@ -167,15 +154,7 @@
         <w:jc w:val="both"/>
       </w:pPr>
       <w:r>
-        <w:t xml:space="preserve">This report covers the concepts behind Tasks 1 through 5 of the Software/ML Domain </w:t>
-      </w:r>
-      <w:proofErr w:type="spellStart"/>
-      <w:r>
-        <w:t>Taskphase</w:t>
-      </w:r>
-      <w:proofErr w:type="spellEnd"/>
-      <w:r>
-        <w:t>. The work moved through five stages: setting up a development environment, writing structured Python programs, reading CSV data two different ways, cleaning a dataset that was genuinely messy, and turning the cleaned data into charts</w:t>
+        <w:t>This report covers the concepts behind Tasks 1 through 5 of the Software/ML Domain Taskphase. The work moved through five stages: setting up a development environment, writing structured Python programs, reading CSV data two different ways, cleaning a dataset that was genuinely messy, and turning the cleaned data into charts</w:t>
       </w:r>
       <w:r>
         <w:t>.</w:t>
@@ -204,15 +183,7 @@
         <w:t xml:space="preserve">The </w:t>
       </w:r>
       <w:r>
-        <w:t xml:space="preserve">purpose of the </w:t>
-      </w:r>
-      <w:proofErr w:type="spellStart"/>
-      <w:r>
-        <w:t>taskphase</w:t>
-      </w:r>
-      <w:proofErr w:type="spellEnd"/>
-      <w:r>
-        <w:t xml:space="preserve"> work until now was to develop fundamental data handling and processing skills</w:t>
+        <w:t>purpose of the taskphase work until now was to develop fundamental data handling and processing skills</w:t>
       </w:r>
       <w:r>
         <w:t>.</w:t>
@@ -255,15 +226,7 @@
         <w:t>GitHub puts that history online so the project can be cloned, reviewed, or run by anyone with the link. Clean repository hygiene</w:t>
       </w:r>
       <w:r>
-        <w:t xml:space="preserve"> means keeping the code repository organized, </w:t>
-      </w:r>
-      <w:proofErr w:type="gramStart"/>
-      <w:r>
-        <w:t>clean(</w:t>
-      </w:r>
-      <w:proofErr w:type="gramEnd"/>
-      <w:r>
-        <w:t>free of unnecessary files or mistakes) and easy to understand</w:t>
+        <w:t xml:space="preserve"> means keeping the code repository organized, clean(free of unnecessary files or mistakes) and easy to understand</w:t>
       </w:r>
       <w:r>
         <w:t xml:space="preserve">. </w:t>
@@ -286,21 +249,13 @@
         <w:t>A Python virtual environment gives each project its own copy of Python</w:t>
       </w:r>
       <w:r>
-        <w:t xml:space="preserve"> or in simple terms is a python installation created specifically for a </w:t>
-      </w:r>
-      <w:proofErr w:type="gramStart"/>
-      <w:r>
-        <w:t xml:space="preserve">project </w:t>
+        <w:t xml:space="preserve"> or in simple terms is a python installation created specifically for a project </w:t>
       </w:r>
       <w:r>
         <w:t>.</w:t>
       </w:r>
       <w:r>
-        <w:t>It</w:t>
-      </w:r>
-      <w:proofErr w:type="gramEnd"/>
-      <w:r>
-        <w:t xml:space="preserve"> allows different projects on the same computer to use different versions of packages without any conflict</w:t>
+        <w:t>It allows different projects on the same computer to use different versions of packages without any conflict</w:t>
       </w:r>
       <w:r>
         <w:t xml:space="preserve">. </w:t>
@@ -338,39 +293,16 @@
         <w:pStyle w:val="Heading2"/>
       </w:pPr>
       <w:r>
-        <w:t xml:space="preserve">2.3 </w:t>
-      </w:r>
-      <w:proofErr w:type="gramStart"/>
-      <w:r>
-        <w:t>The .</w:t>
-      </w:r>
-      <w:proofErr w:type="spellStart"/>
-      <w:r>
-        <w:t>gitignore</w:t>
-      </w:r>
-      <w:proofErr w:type="spellEnd"/>
-      <w:proofErr w:type="gramEnd"/>
-      <w:r>
-        <w:t xml:space="preserve"> File</w:t>
-      </w:r>
-    </w:p>
-    <w:p>
-      <w:pPr>
-        <w:spacing w:after="120" w:line="360" w:lineRule="auto"/>
-        <w:jc w:val="both"/>
-      </w:pPr>
-      <w:proofErr w:type="gramStart"/>
-      <w:r>
-        <w:t>The .</w:t>
-      </w:r>
-      <w:proofErr w:type="spellStart"/>
-      <w:r>
-        <w:t>gitignore</w:t>
-      </w:r>
-      <w:proofErr w:type="spellEnd"/>
-      <w:proofErr w:type="gramEnd"/>
-      <w:r>
-        <w:t xml:space="preserve"> file </w:t>
+        <w:t>2.3 The .gitignore File</w:t>
+      </w:r>
+    </w:p>
+    <w:p>
+      <w:pPr>
+        <w:spacing w:after="120" w:line="360" w:lineRule="auto"/>
+        <w:jc w:val="both"/>
+      </w:pPr>
+      <w:r>
+        <w:t xml:space="preserve">The .gitignore file </w:t>
       </w:r>
       <w:r>
         <w:t>tells</w:t>
@@ -388,37 +320,19 @@
         <w:t xml:space="preserve"> and</w:t>
       </w:r>
       <w:r>
-        <w:t xml:space="preserve"> </w:t>
-      </w:r>
-      <w:proofErr w:type="spellStart"/>
-      <w:r>
-        <w:t>py</w:t>
+        <w:t xml:space="preserve"> py</w:t>
       </w:r>
       <w:r>
         <w:t>_</w:t>
       </w:r>
       <w:r>
-        <w:t>cache</w:t>
-      </w:r>
-      <w:proofErr w:type="spellEnd"/>
-      <w:r>
-        <w:t xml:space="preserve"> directories serve no purpose in the repository</w:t>
-      </w:r>
-      <w:proofErr w:type="gramStart"/>
+        <w:t>cache directories serve no purpose in the repository</w:t>
+      </w:r>
       <w:r>
         <w:t>,</w:t>
       </w:r>
       <w:r>
-        <w:t xml:space="preserve"> .</w:t>
-      </w:r>
-      <w:proofErr w:type="spellStart"/>
-      <w:r>
-        <w:t>gitignore</w:t>
-      </w:r>
-      <w:proofErr w:type="spellEnd"/>
-      <w:proofErr w:type="gramEnd"/>
-      <w:r>
-        <w:t xml:space="preserve"> keeps those things out from the start.</w:t>
+        <w:t xml:space="preserve"> .gitignore keeps those things out from the start.</w:t>
       </w:r>
     </w:p>
     <w:p>
@@ -435,31 +349,7 @@
         <w:jc w:val="both"/>
       </w:pPr>
       <w:r>
-        <w:t xml:space="preserve">The terminal is really the way to get around a file system and look at files. When you use the command </w:t>
-      </w:r>
-      <w:proofErr w:type="spellStart"/>
-      <w:r>
-        <w:t>pwd</w:t>
-      </w:r>
-      <w:proofErr w:type="spellEnd"/>
-      <w:r>
-        <w:t xml:space="preserve"> it shows you where you are. If you use </w:t>
-      </w:r>
-      <w:proofErr w:type="gramStart"/>
-      <w:r>
-        <w:t>ls</w:t>
-      </w:r>
-      <w:proofErr w:type="gramEnd"/>
-      <w:r>
-        <w:t xml:space="preserve"> it shows you what is there. You can use </w:t>
-      </w:r>
-      <w:proofErr w:type="spellStart"/>
-      <w:r>
-        <w:t>mkdir</w:t>
-      </w:r>
-      <w:proofErr w:type="spellEnd"/>
-      <w:r>
-        <w:t>. Cp and mv and rm to do the basic things with files. These things are what you need to do every day.</w:t>
+        <w:t>The terminal is really the way to get around a file system and look at files. When you use the command pwd it shows you where you are. If you use ls it shows you what is there. You can use mkdir. Cp and mv and rm to do the basic things with files. These things are what you need to do every day.</w:t>
       </w:r>
       <w:r>
         <w:rPr>
@@ -472,43 +362,11 @@
         <w:t xml:space="preserve"> </w:t>
       </w:r>
       <w:r>
-        <w:t xml:space="preserve">The commands grep and find are </w:t>
-      </w:r>
-      <w:proofErr w:type="gramStart"/>
-      <w:r>
-        <w:t>really helpful</w:t>
-      </w:r>
-      <w:proofErr w:type="gramEnd"/>
-      <w:r>
-        <w:t xml:space="preserve">. At </w:t>
-      </w:r>
-      <w:proofErr w:type="gramStart"/>
-      <w:r>
-        <w:t>first</w:t>
-      </w:r>
-      <w:proofErr w:type="gramEnd"/>
-      <w:r>
-        <w:t xml:space="preserve"> they might not seem </w:t>
+        <w:t xml:space="preserve">The commands grep and find are really helpful. At first they might not seem </w:t>
       </w:r>
       <w:r>
         <w:lastRenderedPageBreak/>
-        <w:t xml:space="preserve">like much. They are. Grep looks inside files for text. Find helps you locate files by their name or what type of file they are. You can use </w:t>
-      </w:r>
-      <w:proofErr w:type="spellStart"/>
-      <w:r>
-        <w:t>chmod</w:t>
-      </w:r>
-      <w:proofErr w:type="spellEnd"/>
-      <w:r>
-        <w:t xml:space="preserve"> to change the permissions on a file. The command </w:t>
-      </w:r>
-      <w:proofErr w:type="spellStart"/>
-      <w:r>
-        <w:t>wc</w:t>
-      </w:r>
-      <w:proofErr w:type="spellEnd"/>
-      <w:r>
-        <w:t xml:space="preserve"> counts how many lines are, in a file. These are not things to learn but if you know how to use them you can look at a project or fix a script without even opening a file manager.</w:t>
+        <w:t>like much. They are. Grep looks inside files for text. Find helps you locate files by their name or what type of file they are. You can use chmod to change the permissions on a file. The command wc counts how many lines are, in a file. These are not things to learn but if you know how to use them you can look at a project or fix a script without even opening a file manager.</w:t>
       </w:r>
     </w:p>
     <w:p>
@@ -542,31 +400,7 @@
         <w:jc w:val="both"/>
       </w:pPr>
       <w:r>
-        <w:t xml:space="preserve">Type hints make functions easier to read. Writing def </w:t>
-      </w:r>
-      <w:proofErr w:type="spellStart"/>
-      <w:r>
-        <w:t>read_</w:t>
-      </w:r>
-      <w:proofErr w:type="gramStart"/>
-      <w:r>
-        <w:t>file</w:t>
-      </w:r>
-      <w:proofErr w:type="spellEnd"/>
-      <w:r>
-        <w:t>(</w:t>
-      </w:r>
-      <w:proofErr w:type="gramEnd"/>
-      <w:r>
-        <w:t>path: str) -&gt; list[</w:t>
-      </w:r>
-      <w:proofErr w:type="spellStart"/>
-      <w:r>
-        <w:t>dict</w:t>
-      </w:r>
-      <w:proofErr w:type="spellEnd"/>
-      <w:r>
-        <w:t>] tells anyone reading the code exactly what goes in and what comes out, without needing to trace through the body. They do not affect how Python runs the code, but they reduce confusion significantly when someone (including your future self) reads it later.</w:t>
+        <w:t>Type hints make functions easier to read. Writing def read_file(path: str) -&gt; list[dict] tells anyone reading the code exactly what goes in and what comes out, without needing to trace through the body. They do not affect how Python runs the code, but they reduce confusion significantly when someone (including your future self) reads it later.</w:t>
       </w:r>
     </w:p>
     <w:p>
@@ -583,43 +417,19 @@
         <w:jc w:val="both"/>
       </w:pPr>
       <w:r>
-        <w:t xml:space="preserve">File handling enables programs to read data from external files and </w:t>
-      </w:r>
-      <w:proofErr w:type="gramStart"/>
-      <w:r>
-        <w:t>write</w:t>
-      </w:r>
-      <w:proofErr w:type="gramEnd"/>
-      <w:r>
-        <w:t xml:space="preserve"> processed results back to </w:t>
-      </w:r>
-      <w:proofErr w:type="gramStart"/>
-      <w:r>
-        <w:t>disk.</w:t>
-      </w:r>
-      <w:r>
-        <w:t>.</w:t>
-      </w:r>
-      <w:proofErr w:type="gramEnd"/>
-      <w:r>
-        <w:t xml:space="preserve"> Files left open accidentally can cause data loss or errors in longer-running programs.</w:t>
-      </w:r>
-    </w:p>
-    <w:p>
-      <w:pPr>
-        <w:spacing w:after="120" w:line="360" w:lineRule="auto"/>
-        <w:jc w:val="both"/>
-      </w:pPr>
-      <w:r>
-        <w:t xml:space="preserve">The </w:t>
-      </w:r>
-      <w:proofErr w:type="spellStart"/>
-      <w:r>
-        <w:t>taskphase</w:t>
-      </w:r>
-      <w:proofErr w:type="spellEnd"/>
-      <w:r>
-        <w:t xml:space="preserve"> involved reading CSV files, writing JSON summaries, saving cleaned datasets, generating markdown reports, and exporting visualization summaries.</w:t>
+        <w:t>File handling enables programs to read data from external files and write processed results back to disk.</w:t>
+      </w:r>
+      <w:r>
+        <w:t>. Files left open accidentally can cause data loss or errors in longer-running programs.</w:t>
+      </w:r>
+    </w:p>
+    <w:p>
+      <w:pPr>
+        <w:spacing w:after="120" w:line="360" w:lineRule="auto"/>
+        <w:jc w:val="both"/>
+      </w:pPr>
+      <w:r>
+        <w:t>The taskphase involved reading CSV files, writing JSON summaries, saving cleaned datasets, generating markdown reports, and exporting visualization summaries.</w:t>
       </w:r>
       <w:r>
         <w:t xml:space="preserve"> </w:t>
@@ -685,33 +495,7 @@
       </w:pPr>
       <w:r>
         <w:lastRenderedPageBreak/>
-        <w:t xml:space="preserve">In Task </w:t>
-      </w:r>
-      <w:proofErr w:type="gramStart"/>
-      <w:r>
-        <w:t>3,  a</w:t>
-      </w:r>
-      <w:proofErr w:type="gramEnd"/>
-      <w:r>
-        <w:t xml:space="preserve"> CSV parser was built from scratch using only </w:t>
-      </w:r>
-      <w:proofErr w:type="gramStart"/>
-      <w:r>
-        <w:t>open(</w:t>
-      </w:r>
-      <w:proofErr w:type="gramEnd"/>
-      <w:r>
-        <w:t xml:space="preserve">), line iteration, and </w:t>
-      </w:r>
-      <w:proofErr w:type="spellStart"/>
-      <w:proofErr w:type="gramStart"/>
-      <w:r>
-        <w:t>str.split</w:t>
-      </w:r>
-      <w:proofErr w:type="spellEnd"/>
-      <w:proofErr w:type="gramEnd"/>
-      <w:r>
-        <w:t>(). Each line became a dictionary with the header names as keys and the row values as values. Type conversion and blank-line skipping had to be written explicitly.</w:t>
+        <w:t>In Task 3,  a CSV parser was built from scratch using only open(), line iteration, and str.split(). Each line became a dictionary with the header names as keys and the row values as values. Type conversion and blank-line skipping had to be written explicitly.</w:t>
       </w:r>
     </w:p>
     <w:p>
@@ -736,34 +520,8 @@
         <w:spacing w:after="120" w:line="360" w:lineRule="auto"/>
         <w:jc w:val="both"/>
       </w:pPr>
-      <w:proofErr w:type="spellStart"/>
-      <w:proofErr w:type="gramStart"/>
-      <w:r>
-        <w:t>pd.read</w:t>
-      </w:r>
-      <w:proofErr w:type="gramEnd"/>
-      <w:r>
-        <w:t>_</w:t>
-      </w:r>
-      <w:proofErr w:type="gramStart"/>
-      <w:r>
-        <w:t>csv</w:t>
-      </w:r>
-      <w:proofErr w:type="spellEnd"/>
-      <w:r>
-        <w:t>()  reads</w:t>
-      </w:r>
-      <w:proofErr w:type="gramEnd"/>
-      <w:r>
-        <w:t xml:space="preserve"> the header, parses the rows, and returns a </w:t>
-      </w:r>
-      <w:proofErr w:type="spellStart"/>
-      <w:r>
-        <w:t>DataFrame</w:t>
-      </w:r>
-      <w:proofErr w:type="spellEnd"/>
-      <w:r>
-        <w:t>, which is a table that supports column operations, filtering</w:t>
+      <w:r>
+        <w:t>pd.read_csv()  reads the header, parses the rows, and returns a DataFrame, which is a table that supports column operations, filtering</w:t>
       </w:r>
       <w:r>
         <w:t xml:space="preserve"> and</w:t>
@@ -881,15 +639,7 @@
         <w:jc w:val="both"/>
       </w:pPr>
       <w:r>
-        <w:t xml:space="preserve">A blank field is not a zero. A missing score usually means the value was never entered, not that the student scored nothing. The right strategy depends on the column: numeric fields can be filled with the column median, but that decision </w:t>
-      </w:r>
-      <w:proofErr w:type="gramStart"/>
-      <w:r>
-        <w:t>has to</w:t>
-      </w:r>
-      <w:proofErr w:type="gramEnd"/>
-      <w:r>
-        <w:t xml:space="preserve"> be made deliberately and documented. Blindly dropping every row with a missing value can remove more data than you can afford to lose.</w:t>
+        <w:t>A blank field is not a zero. A missing score usually means the value was never entered, not that the student scored nothing. The right strategy depends on the column: numeric fields can be filled with the column median, but that decision has to be made deliberately and documented. Blindly dropping every row with a missing value can remove more data than you can afford to lose.</w:t>
       </w:r>
     </w:p>
     <w:p>
@@ -906,15 +656,7 @@
         <w:jc w:val="both"/>
       </w:pPr>
       <w:r>
-        <w:t xml:space="preserve">After cleaning, the data needs to be checked. Validation confirms that the problems were </w:t>
-      </w:r>
-      <w:proofErr w:type="gramStart"/>
-      <w:r>
-        <w:t>actually fixed</w:t>
-      </w:r>
-      <w:proofErr w:type="gramEnd"/>
-      <w:r>
-        <w:t>: no remaining duplicates, attendance values between 0 and 100, only the expected category labels, no empty critical columns. Without this check, it is easy to think the data is clean when a quiet bug left something broken. Validation is what makes the cleaning trustworthy.</w:t>
+        <w:t>After cleaning, the data needs to be checked. Validation confirms that the problems were actually fixed: no remaining duplicates, attendance values between 0 and 100, only the expected category labels, no empty critical columns. Without this check, it is easy to think the data is clean when a quiet bug left something broken. Validation is what makes the cleaning trustworthy.</w:t>
       </w:r>
     </w:p>
     <w:p>
@@ -998,13 +740,8 @@
         <w:jc w:val="both"/>
       </w:pPr>
       <w:r>
-        <w:t xml:space="preserve">submission_status_count.png has two bars: submitted and not submitted. It shows participation </w:t>
-      </w:r>
-      <w:proofErr w:type="gramStart"/>
-      <w:r>
-        <w:t>at a glance</w:t>
-      </w:r>
-      <w:proofErr w:type="gramEnd"/>
+        <w:t>submission_status_count.png has two bars: submitted and not submitted. It shows participation at a glance</w:t>
+      </w:r>
       <w:r>
         <w:t>.</w:t>
       </w:r>
@@ -1201,7 +938,6 @@
             <w:pPr>
               <w:spacing w:after="40"/>
             </w:pPr>
-            <w:proofErr w:type="spellStart"/>
             <w:r>
               <w:rPr>
                 <w:sz w:val="20"/>
@@ -1216,29 +952,12 @@
               </w:rPr>
               <w:t>hub</w:t>
             </w:r>
-            <w:proofErr w:type="spellEnd"/>
             <w:r>
               <w:rPr>
                 <w:sz w:val="20"/>
                 <w:szCs w:val="20"/>
               </w:rPr>
-              <w:t xml:space="preserve">, </w:t>
-            </w:r>
-            <w:proofErr w:type="spellStart"/>
-            <w:r>
-              <w:rPr>
-                <w:sz w:val="20"/>
-                <w:szCs w:val="20"/>
-              </w:rPr>
-              <w:t>venv</w:t>
-            </w:r>
-            <w:proofErr w:type="spellEnd"/>
-            <w:r>
-              <w:rPr>
-                <w:sz w:val="20"/>
-                <w:szCs w:val="20"/>
-              </w:rPr>
-              <w:t xml:space="preserve">, Linux </w:t>
+              <w:t xml:space="preserve">, venv, Linux </w:t>
             </w:r>
             <w:r>
               <w:rPr>
@@ -1516,21 +1235,12 @@
             <w:pPr>
               <w:spacing w:after="40"/>
             </w:pPr>
-            <w:proofErr w:type="gramStart"/>
             <w:r>
               <w:rPr>
                 <w:sz w:val="20"/>
                 <w:szCs w:val="20"/>
               </w:rPr>
-              <w:t>pandas</w:t>
-            </w:r>
-            <w:proofErr w:type="gramEnd"/>
-            <w:r>
-              <w:rPr>
-                <w:sz w:val="20"/>
-                <w:szCs w:val="20"/>
-              </w:rPr>
-              <w:t xml:space="preserve"> data cleaning</w:t>
+              <w:t>pandas data cleaning</w:t>
             </w:r>
           </w:p>
         </w:tc>
@@ -1652,23 +1362,7 @@
                 <w:sz w:val="20"/>
                 <w:szCs w:val="20"/>
               </w:rPr>
-              <w:t xml:space="preserve">Producing </w:t>
-            </w:r>
-            <w:proofErr w:type="spellStart"/>
-            <w:r>
-              <w:rPr>
-                <w:sz w:val="20"/>
-                <w:szCs w:val="20"/>
-              </w:rPr>
-              <w:t>labeled</w:t>
-            </w:r>
-            <w:proofErr w:type="spellEnd"/>
-            <w:r>
-              <w:rPr>
-                <w:sz w:val="20"/>
-                <w:szCs w:val="20"/>
-              </w:rPr>
-              <w:t>, saved charts from cleaned data.</w:t>
+              <w:t>Producing labeled, saved charts from cleaned data.</w:t>
             </w:r>
           </w:p>
         </w:tc>
@@ -1915,40 +1609,16 @@
         <w:jc w:val="both"/>
       </w:pPr>
       <w:r>
-        <w:t xml:space="preserve">The five tasks form a complete pipeline, from an empty folder to a set of charts. Task 1 put the environment in order. Task 2 built the Python patterns that appear in almost every data script. Task 3 showed what CSV parsing </w:t>
-      </w:r>
-      <w:proofErr w:type="gramStart"/>
-      <w:r>
-        <w:t>actually involves</w:t>
-      </w:r>
-      <w:proofErr w:type="gramEnd"/>
-      <w:r>
-        <w:t xml:space="preserve"> underneath the library. Task 4 showed that data cleaning is harder than it looks and requires deliberate decisions, not just running a function. Task 5 put the cleaned data into a form that is </w:t>
-      </w:r>
-      <w:proofErr w:type="gramStart"/>
-      <w:r>
-        <w:t>actually readable</w:t>
-      </w:r>
-      <w:proofErr w:type="gramEnd"/>
-      <w:r>
-        <w:t>.</w:t>
-      </w:r>
-    </w:p>
-    <w:p>
-      <w:pPr>
-        <w:spacing w:after="120" w:line="360" w:lineRule="auto"/>
-        <w:jc w:val="both"/>
-      </w:pPr>
-      <w:r>
-        <w:t xml:space="preserve">The deeper point is that each step </w:t>
-      </w:r>
-      <w:proofErr w:type="gramStart"/>
-      <w:r>
-        <w:t>has to</w:t>
-      </w:r>
-      <w:proofErr w:type="gramEnd"/>
-      <w:r>
-        <w:t xml:space="preserve"> be done properly for the next one to work. A badly structured repository causes problems later. Skipping type conversion breaks the analysis. Skipping validation means errors get carried forward silently. None of the individual steps are complicated. </w:t>
+        <w:t>The five tasks form a complete pipeline, from an empty folder to a set of charts. Task 1 put the environment in order. Task 2 built the Python patterns that appear in almost every data script. Task 3 showed what CSV parsing actually involves underneath the library. Task 4 showed that data cleaning is harder than it looks and requires deliberate decisions, not just running a function. Task 5 put the cleaned data into a form that is actually readable.</w:t>
+      </w:r>
+    </w:p>
+    <w:p>
+      <w:pPr>
+        <w:spacing w:after="120" w:line="360" w:lineRule="auto"/>
+        <w:jc w:val="both"/>
+      </w:pPr>
+      <w:r>
+        <w:t xml:space="preserve">The deeper point is that each step has to be done properly for the next one to work. A badly structured repository causes problems later. Skipping type conversion breaks the analysis. Skipping validation means errors get carried forward silently. None of the individual steps are complicated. </w:t>
       </w:r>
     </w:p>
     <w:p>
@@ -1989,15 +1659,7 @@
         <w:spacing w:after="120" w:line="360" w:lineRule="auto"/>
       </w:pPr>
       <w:r>
-        <w:t xml:space="preserve">4. Chacon, S. and Straub, B. Pro Git (2nd ed.). </w:t>
-      </w:r>
-      <w:proofErr w:type="spellStart"/>
-      <w:r>
-        <w:t>Apress</w:t>
-      </w:r>
-      <w:proofErr w:type="spellEnd"/>
-      <w:r>
-        <w:t>. https://git-scm.com/book/en/v2</w:t>
+        <w:t>4. Chacon, S. and Straub, B. Pro Git (2nd ed.). Apress. https://git-scm.com/book/en/v2</w:t>
       </w:r>
     </w:p>
     <w:p>

</xml_diff>